<commit_message>
Add OSM traces, docs, plots, and analysis scripts
Add OSM history/traces dataset and related artifacts for trace analysis and evaluation. This changeset adds GPX track files and summary/analysis JSONs under data/, trace quality and ranking evaluation outputs, user histories, new documentation (BACKGROUND_FLOW, METRICS, RELATED_WORK_TABLE, SYSTEM_OVERVIEW and a PDF), multiple plot images, and two analysis/build scripts (analyze_osm_trackpoints.py, build_osm_trace_histories.py). Also updates the project paper file docs/Dynamic Preference-Aware Route Ranking from User History and Temporal Context.docx.
</commit_message>
<xml_diff>
--- a/docs/Dynamic Preference-Aware Route Ranking from User History and Temporal Context.docx
+++ b/docs/Dynamic Preference-Aware Route Ranking from User History and Temporal Context.docx
@@ -585,7 +585,7 @@
     <w:p>
       <w:r>
         <w:pict w14:anchorId="5D6D1D67">
-          <v:rect id="_x0000_i1621" style="width:0;height:1.5pt" o:hralign="center" o:hrstd="t" o:hr="t" fillcolor="#a0a0a0" stroked="f"/>
+          <v:rect id="_x0000_i1025" style="width:0;height:1.5pt" o:hralign="center" o:hrstd="t" o:hr="t" fillcolor="#a0a0a0" stroked="f"/>
         </w:pict>
       </w:r>
     </w:p>
@@ -698,7 +698,7 @@
     <w:p>
       <w:r>
         <w:pict w14:anchorId="3E0DF014">
-          <v:rect id="_x0000_i1622" style="width:0;height:1.5pt" o:hralign="center" o:hrstd="t" o:hr="t" fillcolor="#a0a0a0" stroked="f"/>
+          <v:rect id="_x0000_i1026" style="width:0;height:1.5pt" o:hralign="center" o:hrstd="t" o:hr="t" fillcolor="#a0a0a0" stroked="f"/>
         </w:pict>
       </w:r>
     </w:p>
@@ -859,7 +859,7 @@
     <w:p>
       <w:r>
         <w:pict w14:anchorId="5D9FFD2D">
-          <v:rect id="_x0000_i1624" style="width:0;height:1.5pt" o:hralign="center" o:hrstd="t" o:hr="t" fillcolor="#a0a0a0" stroked="f"/>
+          <v:rect id="_x0000_i1027" style="width:0;height:1.5pt" o:hralign="center" o:hrstd="t" o:hr="t" fillcolor="#a0a0a0" stroked="f"/>
         </w:pict>
       </w:r>
     </w:p>
@@ -978,6 +978,20 @@
       <w:r>
         <w:br/>
         <w:t>Rank candidate routes using profile-based, prompt-based, or hybrid scoring.</w:t>
+      </w:r>
+    </w:p>
+    <w:p/>
+    <w:p/>
+    <w:p>
+      <w:r>
+        <w:lastRenderedPageBreak/>
+        <w:t>OSM public GPS trace data is used as an OSM-native historical movement signal. Since public trackpoint data may not expose clean per-user route histories, movement segments are reconstructed using temporal and spatial continuity heuristics and used as pseudo-history profiles for preliminary evaluation.</w:t>
+      </w:r>
+    </w:p>
+    <w:p/>
+    <w:p>
+      <w:r>
+        <w:t>The OSM trace pipeline successfully retrieved and segmented timestamped public GPS data, reconstructed route-level features, and produced usable ranking metrics. However, the current map-matching/reconstruction stage overestimates route distance, with a median route-to-trace distance ratio of 2.15, slightly above the prototype threshold of 2.0. Therefore, the ranking results are promising, but the segment reconstruction quality needs refinement before treating the data as fully reliable.</w:t>
       </w:r>
     </w:p>
     <w:sectPr>

</xml_diff>